<commit_message>
feat: implement cookie consent banner and update AdSense integration
</commit_message>
<xml_diff>
--- a/IPVA_Calculator_Documentacao.docx
+++ b/IPVA_Calculator_Documentacao.docx
@@ -100,7 +100,7 @@
           </w:tcPr>
           <w:p>
             <w:r>
-              <w:t>Página principal com formulário, resultados, ads e meta tags SEO</w:t>
+              <w:t>Página principal com formulário, resultados, ads AdSense e meta tags SEO</w:t>
             </w:r>
           </w:p>
         </w:tc>
@@ -122,7 +122,7 @@
           </w:tcPr>
           <w:p>
             <w:r>
-              <w:t>Estilos responsivos com design moderno (mobile-first)</w:t>
+              <w:t>Estilos responsivos com design moderno, ads e cookie consent</w:t>
             </w:r>
           </w:p>
         </w:tc>
@@ -144,7 +144,29 @@
           </w:tcPr>
           <w:p>
             <w:r>
-              <w:t>Lógica de cálculo, máscara monetária, estados e analytics</w:t>
+              <w:t>Lógica de cálculo, máscara monetária, estados, analytics e consentimento LGPD</w:t>
+            </w:r>
+          </w:p>
+        </w:tc>
+      </w:tr>
+      <w:tr>
+        <w:tc>
+          <w:tcPr>
+            <w:tcW w:type="dxa" w:w="4320"/>
+          </w:tcPr>
+          <w:p>
+            <w:r>
+              <w:t>ads.txt</w:t>
+            </w:r>
+          </w:p>
+        </w:tc>
+        <w:tc>
+          <w:tcPr>
+            <w:tcW w:type="dxa" w:w="4320"/>
+          </w:tcPr>
+          <w:p>
+            <w:r>
+              <w:t>Arquivo de verificação obrigatório do Google AdSense</w:t>
             </w:r>
           </w:p>
         </w:tc>
@@ -560,12 +582,15 @@
         <w:pStyle w:val="Heading1"/>
       </w:pPr>
       <w:r>
-        <w:t>6. Espaços Publicitários (Ads)</w:t>
+        <w:t>6. Publicidade — Google AdSense</w:t>
       </w:r>
     </w:p>
     <w:p>
+      <w:pPr>
+        <w:pStyle w:val="Heading2"/>
+      </w:pPr>
       <w:r>
-        <w:t>O layout possui 4 posições de anúncio prontas para integração com Google AdSense ou redes similares:</w:t>
+        <w:t>6.1. Pré-requisitos para Aprovação do AdSense</w:t>
       </w:r>
     </w:p>
     <w:p>
@@ -573,13 +598,7 @@
         <w:pStyle w:val="ListBullet"/>
       </w:pPr>
       <w:r>
-        <w:rPr>
-          <w:b/>
-        </w:rPr>
-        <w:t xml:space="preserve">Ad Top: </w:t>
-      </w:r>
-      <w:r>
-        <w:t>Banner horizontal no topo da página (728×90 ou responsivo)</w:t>
+        <w:t>Domínio próprio ativo (ex: ipva.fsncompany.com.br) — AdSense não aceita subdomínios do Render (.onrender.com)</w:t>
       </w:r>
     </w:p>
     <w:p>
@@ -587,13 +606,7 @@
         <w:pStyle w:val="ListBullet"/>
       </w:pPr>
       <w:r>
-        <w:rPr>
-          <w:b/>
-        </w:rPr>
-        <w:t xml:space="preserve">Ad Bottom: </w:t>
-      </w:r>
-      <w:r>
-        <w:t>Banner horizontal no rodapé (728×90 ou responsivo)</w:t>
+        <w:t>Conteúdo original e útil publicado (a calculadora já atende esse requisito)</w:t>
       </w:r>
     </w:p>
     <w:p>
@@ -601,13 +614,7 @@
         <w:pStyle w:val="ListBullet"/>
       </w:pPr>
       <w:r>
-        <w:rPr>
-          <w:b/>
-        </w:rPr>
-        <w:t xml:space="preserve">Ad Left: </w:t>
-      </w:r>
-      <w:r>
-        <w:t>Banner vertical na lateral esquerda (160×600) — oculto em mobile</w:t>
+        <w:t>Política de Privacidade publicada no site (obrigatório pela LGPD e pelo AdSense)</w:t>
       </w:r>
     </w:p>
     <w:p>
@@ -615,18 +622,605 @@
         <w:pStyle w:val="ListBullet"/>
       </w:pPr>
       <w:r>
-        <w:rPr>
-          <w:b/>
-        </w:rPr>
-        <w:t xml:space="preserve">Ad Right: </w:t>
+        <w:t>Mínimo de 2-4 semanas de site no ar com tráfego antes de solicitar aprovação</w:t>
       </w:r>
+    </w:p>
+    <w:p>
+      <w:pPr>
+        <w:pStyle w:val="ListBullet"/>
+      </w:pPr>
       <w:r>
-        <w:t>Banner vertical na lateral direita (160×600) — oculto em mobile</w:t>
+        <w:t>O site não pode ter conteúdo adulto, violento ou ilegal</w:t>
+      </w:r>
+    </w:p>
+    <w:p>
+      <w:pPr>
+        <w:pStyle w:val="Heading2"/>
+      </w:pPr>
+      <w:r>
+        <w:t>6.2. Passo a Passo para Integração</w:t>
       </w:r>
     </w:p>
     <w:p>
       <w:r>
-        <w:t>Para ativar, substitua os placeholders &lt;div class="ad-placeholder"&gt; pelo código fornecido pelo Google AdSense ou outra rede de anúncios.</w:t>
+        <w:t>1. Acesse adsense.google.com e clique em "Começar"</w:t>
+      </w:r>
+    </w:p>
+    <w:p>
+      <w:r>
+        <w:t>2. Cadastre o domínio "ipva.fsncompany.com.br" e aceite os termos</w:t>
+      </w:r>
+    </w:p>
+    <w:p>
+      <w:r>
+        <w:t>3. O Google fornecerá um Publisher ID no formato "ca-pub-XXXXXXXXXXXXXXXX"</w:t>
+      </w:r>
+    </w:p>
+    <w:p>
+      <w:r>
+        <w:t>4. No index.html, substitua TODAS as ocorrências de "ca-pub-XXXXXXXXXXXXXXXX" pelo seu Publisher ID real</w:t>
+      </w:r>
+    </w:p>
+    <w:p>
+      <w:r>
+        <w:t>5. O Google fornecerá também Slot IDs para cada unidade de anúncio — substitua os valores _AD_SLOT_ID correspondentes</w:t>
+      </w:r>
+    </w:p>
+    <w:p>
+      <w:r>
+        <w:t>6. No arquivo ads.txt (na raiz do site), substitua "pub-XXXXXXXXXXXXXXXX" pelo número do seu Publisher ID</w:t>
+      </w:r>
+    </w:p>
+    <w:p>
+      <w:r>
+        <w:t>7. Faça deploy e aguarde a verificação do Google (pode levar de 24h a 2 semanas)</w:t>
+      </w:r>
+    </w:p>
+    <w:p>
+      <w:pPr>
+        <w:pStyle w:val="Heading2"/>
+      </w:pPr>
+      <w:r>
+        <w:t>6.3. Posições de Anúncios Configuradas</w:t>
+      </w:r>
+    </w:p>
+    <w:p>
+      <w:r>
+        <w:t>O site possui 5 posições de anúncio otimizadas para máxima receita sem prejudicar a experiência:</w:t>
+      </w:r>
+    </w:p>
+    <w:tbl>
+      <w:tblPr>
+        <w:tblStyle w:val="LightGrid-Accent1"/>
+        <w:tblW w:type="auto" w:w="0"/>
+        <w:jc w:val="center"/>
+        <w:tblLook w:firstColumn="1" w:firstRow="1" w:lastColumn="0" w:lastRow="0" w:noHBand="0" w:noVBand="1" w:val="04A0"/>
+      </w:tblPr>
+      <w:tblGrid>
+        <w:gridCol w:w="4320"/>
+        <w:gridCol w:w="4320"/>
+      </w:tblGrid>
+      <w:tr>
+        <w:tc>
+          <w:tcPr>
+            <w:tcW w:type="dxa" w:w="4320"/>
+          </w:tcPr>
+          <w:p>
+            <w:r>
+              <w:t>Posição</w:t>
+            </w:r>
+          </w:p>
+        </w:tc>
+        <w:tc>
+          <w:tcPr>
+            <w:tcW w:type="dxa" w:w="4320"/>
+          </w:tcPr>
+          <w:p>
+            <w:r>
+              <w:t>Descrição e Formato</w:t>
+            </w:r>
+          </w:p>
+        </w:tc>
+      </w:tr>
+      <w:tr>
+        <w:tc>
+          <w:tcPr>
+            <w:tcW w:type="dxa" w:w="4320"/>
+          </w:tcPr>
+          <w:p>
+            <w:r>
+              <w:t>Ad Top (Leaderboard)</w:t>
+            </w:r>
+          </w:p>
+        </w:tc>
+        <w:tc>
+          <w:tcPr>
+            <w:tcW w:type="dxa" w:w="4320"/>
+          </w:tcPr>
+          <w:p>
+            <w:r>
+              <w:t>Banner horizontal no topo — formato 728×90 desktop / responsivo mobile. data-ad-format="horizontal"</w:t>
+            </w:r>
+          </w:p>
+        </w:tc>
+      </w:tr>
+      <w:tr>
+        <w:tc>
+          <w:tcPr>
+            <w:tcW w:type="dxa" w:w="4320"/>
+          </w:tcPr>
+          <w:p>
+            <w:r>
+              <w:t>Ad Left (Skyscraper)</w:t>
+            </w:r>
+          </w:p>
+        </w:tc>
+        <w:tc>
+          <w:tcPr>
+            <w:tcW w:type="dxa" w:w="4320"/>
+          </w:tcPr>
+          <w:p>
+            <w:r>
+              <w:t>Banner vertical lateral esquerda — formato 160×600. Visível apenas em desktop (&gt;1200px). data-ad-format="vertical"</w:t>
+            </w:r>
+          </w:p>
+        </w:tc>
+      </w:tr>
+      <w:tr>
+        <w:tc>
+          <w:tcPr>
+            <w:tcW w:type="dxa" w:w="4320"/>
+          </w:tcPr>
+          <w:p>
+            <w:r>
+              <w:t>Ad Right (Skyscraper)</w:t>
+            </w:r>
+          </w:p>
+        </w:tc>
+        <w:tc>
+          <w:tcPr>
+            <w:tcW w:type="dxa" w:w="4320"/>
+          </w:tcPr>
+          <w:p>
+            <w:r>
+              <w:t>Banner vertical lateral direita — formato 160×600. Visível apenas em desktop (&gt;1200px). data-ad-format="vertical"</w:t>
+            </w:r>
+          </w:p>
+        </w:tc>
+      </w:tr>
+      <w:tr>
+        <w:tc>
+          <w:tcPr>
+            <w:tcW w:type="dxa" w:w="4320"/>
+          </w:tcPr>
+          <w:p>
+            <w:r>
+              <w:t>Ad In-Article (Fluid)</w:t>
+            </w:r>
+          </w:p>
+        </w:tc>
+        <w:tc>
+          <w:tcPr>
+            <w:tcW w:type="dxa" w:w="4320"/>
+          </w:tcPr>
+          <w:p>
+            <w:r>
+              <w:t>Anúncio nativo entre o resultado do cálculo e o FAQ — zona de alta atenção. data-ad-format="fluid", data-ad-layout="in-article"</w:t>
+            </w:r>
+          </w:p>
+        </w:tc>
+      </w:tr>
+      <w:tr>
+        <w:tc>
+          <w:tcPr>
+            <w:tcW w:type="dxa" w:w="4320"/>
+          </w:tcPr>
+          <w:p>
+            <w:r>
+              <w:t>Ad Bottom (Leaderboard)</w:t>
+            </w:r>
+          </w:p>
+        </w:tc>
+        <w:tc>
+          <w:tcPr>
+            <w:tcW w:type="dxa" w:w="4320"/>
+          </w:tcPr>
+          <w:p>
+            <w:r>
+              <w:t>Banner horizontal no rodapé — formato 728×90 desktop / responsivo mobile. data-ad-format="horizontal"</w:t>
+            </w:r>
+          </w:p>
+        </w:tc>
+      </w:tr>
+    </w:tbl>
+    <w:p>
+      <w:pPr>
+        <w:pStyle w:val="Heading2"/>
+      </w:pPr>
+      <w:r>
+        <w:t>6.4. Arquivo ads.txt</w:t>
+      </w:r>
+    </w:p>
+    <w:p>
+      <w:r>
+        <w:t>O arquivo ads.txt na raiz do site é obrigatório para que o AdSense verifique a propriedade. Ele deve ser acessível em: https://ipva.fsncompany.com.br/ads.txt. Conteúdo: "google.com, pub-XXXXXXXXXXXXXXXX, DIRECT, f08c47fec0942fa0" (substituir pelo seu Publisher ID).</w:t>
+      </w:r>
+    </w:p>
+    <w:p>
+      <w:pPr>
+        <w:pStyle w:val="Heading2"/>
+      </w:pPr>
+      <w:r>
+        <w:t>6.5. Consentimento de Cookies (LGPD)</w:t>
+      </w:r>
+    </w:p>
+    <w:p>
+      <w:r>
+        <w:t>O site inclui um banner de consentimento de cookies que aparece na primeira visita. É obrigatório pela LGPD (Lei Geral de Proteção de Dados) brasileira e pelas políticas do AdSense.</w:t>
+      </w:r>
+    </w:p>
+    <w:p>
+      <w:pPr>
+        <w:pStyle w:val="ListBullet"/>
+      </w:pPr>
+      <w:r>
+        <w:t>Se o usuário aceitar: anúncios personalizados são exibidos (maior receita)</w:t>
+      </w:r>
+    </w:p>
+    <w:p>
+      <w:pPr>
+        <w:pStyle w:val="ListBullet"/>
+      </w:pPr>
+      <w:r>
+        <w:t>Se o usuário recusar: anúncios genéricos são exibidos (adsbygoogle.requestNonPersonalizedAds = 1)</w:t>
+      </w:r>
+    </w:p>
+    <w:p>
+      <w:pPr>
+        <w:pStyle w:val="ListBullet"/>
+      </w:pPr>
+      <w:r>
+        <w:t>O consentimento é salvo em localStorage e não é solicitado novamente</w:t>
+      </w:r>
+    </w:p>
+    <w:p>
+      <w:pPr>
+        <w:pStyle w:val="ListBullet"/>
+      </w:pPr>
+      <w:r>
+        <w:t>Evento "cookie_consent" é enviado ao GA4 para métricas de taxa de aceite</w:t>
+      </w:r>
+    </w:p>
+    <w:p>
+      <w:pPr>
+        <w:pStyle w:val="Heading2"/>
+      </w:pPr>
+      <w:r>
+        <w:t>6.6. Placeholders de IDs para Substituir</w:t>
+      </w:r>
+    </w:p>
+    <w:p>
+      <w:r>
+        <w:t>Ao receber sua aprovação do AdSense, substitua os seguintes placeholders nos arquivos:</w:t>
+      </w:r>
+    </w:p>
+    <w:tbl>
+      <w:tblPr>
+        <w:tblStyle w:val="LightGrid-Accent1"/>
+        <w:tblW w:type="auto" w:w="0"/>
+        <w:jc w:val="center"/>
+        <w:tblLook w:firstColumn="1" w:firstRow="1" w:lastColumn="0" w:lastRow="0" w:noHBand="0" w:noVBand="1" w:val="04A0"/>
+      </w:tblPr>
+      <w:tblGrid>
+        <w:gridCol w:w="2880"/>
+        <w:gridCol w:w="2880"/>
+        <w:gridCol w:w="2880"/>
+      </w:tblGrid>
+      <w:tr>
+        <w:tc>
+          <w:tcPr>
+            <w:tcW w:type="dxa" w:w="2880"/>
+          </w:tcPr>
+          <w:p>
+            <w:r>
+              <w:t>Placeholder</w:t>
+            </w:r>
+          </w:p>
+        </w:tc>
+        <w:tc>
+          <w:tcPr>
+            <w:tcW w:type="dxa" w:w="2880"/>
+          </w:tcPr>
+          <w:p>
+            <w:r>
+              <w:t>Arquivo</w:t>
+            </w:r>
+          </w:p>
+        </w:tc>
+        <w:tc>
+          <w:tcPr>
+            <w:tcW w:type="dxa" w:w="2880"/>
+          </w:tcPr>
+          <w:p>
+            <w:r>
+              <w:t>O que colocar</w:t>
+            </w:r>
+          </w:p>
+        </w:tc>
+      </w:tr>
+      <w:tr>
+        <w:tc>
+          <w:tcPr>
+            <w:tcW w:type="dxa" w:w="2880"/>
+          </w:tcPr>
+          <w:p>
+            <w:r>
+              <w:t>ca-pub-XXXXXXXXXXXXXXXX</w:t>
+            </w:r>
+          </w:p>
+        </w:tc>
+        <w:tc>
+          <w:tcPr>
+            <w:tcW w:type="dxa" w:w="2880"/>
+          </w:tcPr>
+          <w:p>
+            <w:r>
+              <w:t>index.html (6 ocorrências)</w:t>
+            </w:r>
+          </w:p>
+        </w:tc>
+        <w:tc>
+          <w:tcPr>
+            <w:tcW w:type="dxa" w:w="2880"/>
+          </w:tcPr>
+          <w:p>
+            <w:r>
+              <w:t>Seu Publisher ID do AdSense</w:t>
+            </w:r>
+          </w:p>
+        </w:tc>
+      </w:tr>
+      <w:tr>
+        <w:tc>
+          <w:tcPr>
+            <w:tcW w:type="dxa" w:w="2880"/>
+          </w:tcPr>
+          <w:p>
+            <w:r>
+              <w:t>TOP_AD_SLOT_ID</w:t>
+            </w:r>
+          </w:p>
+        </w:tc>
+        <w:tc>
+          <w:tcPr>
+            <w:tcW w:type="dxa" w:w="2880"/>
+          </w:tcPr>
+          <w:p>
+            <w:r>
+              <w:t>index.html</w:t>
+            </w:r>
+          </w:p>
+        </w:tc>
+        <w:tc>
+          <w:tcPr>
+            <w:tcW w:type="dxa" w:w="2880"/>
+          </w:tcPr>
+          <w:p>
+            <w:r>
+              <w:t>Slot ID do anúncio do topo</w:t>
+            </w:r>
+          </w:p>
+        </w:tc>
+      </w:tr>
+      <w:tr>
+        <w:tc>
+          <w:tcPr>
+            <w:tcW w:type="dxa" w:w="2880"/>
+          </w:tcPr>
+          <w:p>
+            <w:r>
+              <w:t>LEFT_AD_SLOT_ID</w:t>
+            </w:r>
+          </w:p>
+        </w:tc>
+        <w:tc>
+          <w:tcPr>
+            <w:tcW w:type="dxa" w:w="2880"/>
+          </w:tcPr>
+          <w:p>
+            <w:r>
+              <w:t>index.html</w:t>
+            </w:r>
+          </w:p>
+        </w:tc>
+        <w:tc>
+          <w:tcPr>
+            <w:tcW w:type="dxa" w:w="2880"/>
+          </w:tcPr>
+          <w:p>
+            <w:r>
+              <w:t>Slot ID do anúncio esquerdo</w:t>
+            </w:r>
+          </w:p>
+        </w:tc>
+      </w:tr>
+      <w:tr>
+        <w:tc>
+          <w:tcPr>
+            <w:tcW w:type="dxa" w:w="2880"/>
+          </w:tcPr>
+          <w:p>
+            <w:r>
+              <w:t>RIGHT_AD_SLOT_ID</w:t>
+            </w:r>
+          </w:p>
+        </w:tc>
+        <w:tc>
+          <w:tcPr>
+            <w:tcW w:type="dxa" w:w="2880"/>
+          </w:tcPr>
+          <w:p>
+            <w:r>
+              <w:t>index.html</w:t>
+            </w:r>
+          </w:p>
+        </w:tc>
+        <w:tc>
+          <w:tcPr>
+            <w:tcW w:type="dxa" w:w="2880"/>
+          </w:tcPr>
+          <w:p>
+            <w:r>
+              <w:t>Slot ID do anúncio direito</w:t>
+            </w:r>
+          </w:p>
+        </w:tc>
+      </w:tr>
+      <w:tr>
+        <w:tc>
+          <w:tcPr>
+            <w:tcW w:type="dxa" w:w="2880"/>
+          </w:tcPr>
+          <w:p>
+            <w:r>
+              <w:t>IN_ARTICLE_AD_SLOT_ID</w:t>
+            </w:r>
+          </w:p>
+        </w:tc>
+        <w:tc>
+          <w:tcPr>
+            <w:tcW w:type="dxa" w:w="2880"/>
+          </w:tcPr>
+          <w:p>
+            <w:r>
+              <w:t>index.html</w:t>
+            </w:r>
+          </w:p>
+        </w:tc>
+        <w:tc>
+          <w:tcPr>
+            <w:tcW w:type="dxa" w:w="2880"/>
+          </w:tcPr>
+          <w:p>
+            <w:r>
+              <w:t>Slot ID do anúncio in-article</w:t>
+            </w:r>
+          </w:p>
+        </w:tc>
+      </w:tr>
+      <w:tr>
+        <w:tc>
+          <w:tcPr>
+            <w:tcW w:type="dxa" w:w="2880"/>
+          </w:tcPr>
+          <w:p>
+            <w:r>
+              <w:t>BOTTOM_AD_SLOT_ID</w:t>
+            </w:r>
+          </w:p>
+        </w:tc>
+        <w:tc>
+          <w:tcPr>
+            <w:tcW w:type="dxa" w:w="2880"/>
+          </w:tcPr>
+          <w:p>
+            <w:r>
+              <w:t>index.html</w:t>
+            </w:r>
+          </w:p>
+        </w:tc>
+        <w:tc>
+          <w:tcPr>
+            <w:tcW w:type="dxa" w:w="2880"/>
+          </w:tcPr>
+          <w:p>
+            <w:r>
+              <w:t>Slot ID do anúncio do rodapé</w:t>
+            </w:r>
+          </w:p>
+        </w:tc>
+      </w:tr>
+      <w:tr>
+        <w:tc>
+          <w:tcPr>
+            <w:tcW w:type="dxa" w:w="2880"/>
+          </w:tcPr>
+          <w:p>
+            <w:r>
+              <w:t>pub-XXXXXXXXXXXXXXXX</w:t>
+            </w:r>
+          </w:p>
+        </w:tc>
+        <w:tc>
+          <w:tcPr>
+            <w:tcW w:type="dxa" w:w="2880"/>
+          </w:tcPr>
+          <w:p>
+            <w:r>
+              <w:t>ads.txt</w:t>
+            </w:r>
+          </w:p>
+        </w:tc>
+        <w:tc>
+          <w:tcPr>
+            <w:tcW w:type="dxa" w:w="2880"/>
+          </w:tcPr>
+          <w:p>
+            <w:r>
+              <w:t>Seu Publisher ID (sem "ca-")</w:t>
+            </w:r>
+          </w:p>
+        </w:tc>
+      </w:tr>
+    </w:tbl>
+    <w:p>
+      <w:pPr>
+        <w:pStyle w:val="Heading2"/>
+      </w:pPr>
+      <w:r>
+        <w:t>6.7. Estimativa de Receita</w:t>
+      </w:r>
+    </w:p>
+    <w:p>
+      <w:r>
+        <w:t>A receita depende do tráfego e do nicho. Para um site de calculadora financeira no Brasil, a estimativa média é:</w:t>
+      </w:r>
+    </w:p>
+    <w:p>
+      <w:pPr>
+        <w:pStyle w:val="ListBullet"/>
+      </w:pPr>
+      <w:r>
+        <w:t>1.000 visitas/dia → R$ 30-80/mês</w:t>
+      </w:r>
+    </w:p>
+    <w:p>
+      <w:pPr>
+        <w:pStyle w:val="ListBullet"/>
+      </w:pPr>
+      <w:r>
+        <w:t>5.000 visitas/dia → R$ 150-400/mês</w:t>
+      </w:r>
+    </w:p>
+    <w:p>
+      <w:pPr>
+        <w:pStyle w:val="ListBullet"/>
+      </w:pPr>
+      <w:r>
+        <w:t>10.000 visitas/dia → R$ 300-900/mês</w:t>
+      </w:r>
+    </w:p>
+    <w:p>
+      <w:pPr>
+        <w:pStyle w:val="ListBullet"/>
+      </w:pPr>
+      <w:r>
+        <w:t>50.000 visitas/dia → R$ 1.500-5.000/mês</w:t>
+      </w:r>
+    </w:p>
+    <w:p>
+      <w:r>
+        <w:t>O nicho de IPVA/finanças tem CPM (custo por mil impressões) acima da média, especialmente durante o período de pagamento do IPVA (janeiro-março).</w:t>
       </w:r>
     </w:p>
     <w:p/>
@@ -837,6 +1431,28 @@
           </w:p>
         </w:tc>
       </w:tr>
+      <w:tr>
+        <w:tc>
+          <w:tcPr>
+            <w:tcW w:type="dxa" w:w="4320"/>
+          </w:tcPr>
+          <w:p>
+            <w:r>
+              <w:t>cookie_consent</w:t>
+            </w:r>
+          </w:p>
+        </w:tc>
+        <w:tc>
+          <w:tcPr>
+            <w:tcW w:type="dxa" w:w="4320"/>
+          </w:tcPr>
+          <w:p>
+            <w:r>
+              <w:t>Consentimento de cookies aceito ou recusado</w:t>
+            </w:r>
+          </w:p>
+        </w:tc>
+      </w:tr>
     </w:tbl>
     <w:p/>
     <w:p>
@@ -865,12 +1481,12 @@
         <w:pStyle w:val="Heading2"/>
       </w:pPr>
       <w:r>
-        <w:t>8.2. Domínio: ipva.novocalculo.com.br</w:t>
+        <w:t>8.2. Domínio: ipva.fsncompany.com.br</w:t>
       </w:r>
     </w:p>
     <w:p>
       <w:r>
-        <w:t>"ipva" é um subdomínio de "novocalculo.com.br". O processo é:</w:t>
+        <w:t>"ipva" é um subdomínio de "fsncompany.com.br". O processo é:</w:t>
       </w:r>
     </w:p>
     <w:p>
@@ -878,7 +1494,7 @@
         <w:pStyle w:val="ListNumber"/>
       </w:pPr>
       <w:r>
-        <w:t>Registrar o domínio "novocalculo.com.br" em um registrador (ex: Registro.br)</w:t>
+        <w:t>Registrar o domínio "fsncompany.com.br" em um registrador (ex: Registro.br)</w:t>
       </w:r>
     </w:p>
     <w:p>
@@ -886,7 +1502,7 @@
         <w:pStyle w:val="ListNumber"/>
       </w:pPr>
       <w:r>
-        <w:t>No Render Dashboard → Custom Domains → Adicionar "ipva.novocalculo.com.br"</w:t>
+        <w:t>No Render Dashboard → Custom Domains → Adicionar "ipva.fsncompany.com.br"</w:t>
       </w:r>
     </w:p>
     <w:p>
@@ -942,7 +1558,7 @@
         <w:pStyle w:val="ListBullet"/>
       </w:pPr>
       <w:r>
-        <w:t>novocalculo.com.br (usando path /ipva ao invés de subdomínio)</w:t>
+        <w:t>fsncompany.com.br (usando path /ipva ao invés de subdomínio)</w:t>
       </w:r>
     </w:p>
     <w:p/>
@@ -1050,7 +1666,7 @@
           <w:color w:val="94A3B8"/>
           <w:sz w:val="18"/>
         </w:rPr>
-        <w:t>© 2026 NovoCalculo — Documento gerado automaticamente</w:t>
+        <w:t>© 2026 FSN Company — Documento gerado automaticamente</w:t>
       </w:r>
     </w:p>
     <w:sectPr>

</xml_diff>

<commit_message>
feat: add build script for env var injection and ads.txt
Build script replaces placeholder IDs (GA4, Clarity, AdSense)
with Render environment variables at deploy time.

Co-authored-by: Cursor <cursoragent@cursor.com>
</commit_message>
<xml_diff>
--- a/IPVA_Calculator_Documentacao.docx
+++ b/IPVA_Calculator_Documentacao.docx
@@ -1591,7 +1591,7 @@
         <w:pStyle w:val="ListNumber"/>
       </w:pPr>
       <w:r>
-        <w:t>Branch: main | Publish Directory: . (raiz)</w:t>
+        <w:t>Branch: main | Build Command: chmod +x build.sh &amp;&amp; ./build.sh | Publish Directory: . (raiz)</w:t>
       </w:r>
     </w:p>
     <w:p>
@@ -1599,7 +1599,7 @@
         <w:pStyle w:val="ListNumber"/>
       </w:pPr>
       <w:r>
-        <w:t>O Render fará deploy automático a cada push no main</w:t>
+        <w:t>O Render fará deploy automático a cada push no main (auto-deploy ativado)</w:t>
       </w:r>
     </w:p>
     <w:p>
@@ -1608,6 +1608,326 @@
       </w:pPr>
       <w:r>
         <w:t>Configurar domínio customizado conforme seção 8.2</w:t>
+      </w:r>
+    </w:p>
+    <w:p/>
+    <w:p>
+      <w:pPr>
+        <w:pStyle w:val="Heading2"/>
+      </w:pPr>
+      <w:r>
+        <w:t>9.1. Environment Variables (Render)</w:t>
+      </w:r>
+    </w:p>
+    <w:p>
+      <w:r>
+        <w:t>Os IDs de serviços externos são injetados via Environment Variables no Render, evitando que dados sensíveis fiquem commitados no código. O script build.sh substitui os placeholders durante o build.</w:t>
+      </w:r>
+    </w:p>
+    <w:tbl>
+      <w:tblPr>
+        <w:tblStyle w:val="LightGrid-Accent1"/>
+        <w:tblW w:type="auto" w:w="0"/>
+        <w:jc w:val="center"/>
+        <w:tblLook w:firstColumn="1" w:firstRow="1" w:lastColumn="0" w:lastRow="0" w:noHBand="0" w:noVBand="1" w:val="04A0"/>
+      </w:tblPr>
+      <w:tblGrid>
+        <w:gridCol w:w="2880"/>
+        <w:gridCol w:w="2880"/>
+        <w:gridCol w:w="2880"/>
+      </w:tblGrid>
+      <w:tr>
+        <w:tc>
+          <w:tcPr>
+            <w:tcW w:type="dxa" w:w="2880"/>
+          </w:tcPr>
+          <w:p>
+            <w:r>
+              <w:t>Variável</w:t>
+            </w:r>
+          </w:p>
+        </w:tc>
+        <w:tc>
+          <w:tcPr>
+            <w:tcW w:type="dxa" w:w="2880"/>
+          </w:tcPr>
+          <w:p>
+            <w:r>
+              <w:t>Descrição</w:t>
+            </w:r>
+          </w:p>
+        </w:tc>
+        <w:tc>
+          <w:tcPr>
+            <w:tcW w:type="dxa" w:w="2880"/>
+          </w:tcPr>
+          <w:p>
+            <w:r>
+              <w:t>Exemplo</w:t>
+            </w:r>
+          </w:p>
+        </w:tc>
+      </w:tr>
+      <w:tr>
+        <w:tc>
+          <w:tcPr>
+            <w:tcW w:type="dxa" w:w="2880"/>
+          </w:tcPr>
+          <w:p>
+            <w:r>
+              <w:t>GA_MEASUREMENT_ID</w:t>
+            </w:r>
+          </w:p>
+        </w:tc>
+        <w:tc>
+          <w:tcPr>
+            <w:tcW w:type="dxa" w:w="2880"/>
+          </w:tcPr>
+          <w:p>
+            <w:r>
+              <w:t>ID do Google Analytics 4</w:t>
+            </w:r>
+          </w:p>
+        </w:tc>
+        <w:tc>
+          <w:tcPr>
+            <w:tcW w:type="dxa" w:w="2880"/>
+          </w:tcPr>
+          <w:p>
+            <w:r>
+              <w:t>Ex: G-A1B2C3D4E5</w:t>
+            </w:r>
+          </w:p>
+        </w:tc>
+      </w:tr>
+      <w:tr>
+        <w:tc>
+          <w:tcPr>
+            <w:tcW w:type="dxa" w:w="2880"/>
+          </w:tcPr>
+          <w:p>
+            <w:r>
+              <w:t>CLARITY_ID</w:t>
+            </w:r>
+          </w:p>
+        </w:tc>
+        <w:tc>
+          <w:tcPr>
+            <w:tcW w:type="dxa" w:w="2880"/>
+          </w:tcPr>
+          <w:p>
+            <w:r>
+              <w:t>ID do Microsoft Clarity</w:t>
+            </w:r>
+          </w:p>
+        </w:tc>
+        <w:tc>
+          <w:tcPr>
+            <w:tcW w:type="dxa" w:w="2880"/>
+          </w:tcPr>
+          <w:p>
+            <w:r>
+              <w:t>Ex: abc123xyz</w:t>
+            </w:r>
+          </w:p>
+        </w:tc>
+      </w:tr>
+      <w:tr>
+        <w:tc>
+          <w:tcPr>
+            <w:tcW w:type="dxa" w:w="2880"/>
+          </w:tcPr>
+          <w:p>
+            <w:r>
+              <w:t>ADSENSE_PUB_ID</w:t>
+            </w:r>
+          </w:p>
+        </w:tc>
+        <w:tc>
+          <w:tcPr>
+            <w:tcW w:type="dxa" w:w="2880"/>
+          </w:tcPr>
+          <w:p>
+            <w:r>
+              <w:t>Publisher ID do Google AdSense</w:t>
+            </w:r>
+          </w:p>
+        </w:tc>
+        <w:tc>
+          <w:tcPr>
+            <w:tcW w:type="dxa" w:w="2880"/>
+          </w:tcPr>
+          <w:p>
+            <w:r>
+              <w:t>Ex: ca-pub-1234567890123456</w:t>
+            </w:r>
+          </w:p>
+        </w:tc>
+      </w:tr>
+      <w:tr>
+        <w:tc>
+          <w:tcPr>
+            <w:tcW w:type="dxa" w:w="2880"/>
+          </w:tcPr>
+          <w:p>
+            <w:r>
+              <w:t>AD_SLOT_TOP</w:t>
+            </w:r>
+          </w:p>
+        </w:tc>
+        <w:tc>
+          <w:tcPr>
+            <w:tcW w:type="dxa" w:w="2880"/>
+          </w:tcPr>
+          <w:p>
+            <w:r>
+              <w:t>Slot ID do anúncio do topo</w:t>
+            </w:r>
+          </w:p>
+        </w:tc>
+        <w:tc>
+          <w:tcPr>
+            <w:tcW w:type="dxa" w:w="2880"/>
+          </w:tcPr>
+          <w:p>
+            <w:r>
+              <w:t>Ex: 1234567890</w:t>
+            </w:r>
+          </w:p>
+        </w:tc>
+      </w:tr>
+      <w:tr>
+        <w:tc>
+          <w:tcPr>
+            <w:tcW w:type="dxa" w:w="2880"/>
+          </w:tcPr>
+          <w:p>
+            <w:r>
+              <w:t>AD_SLOT_LEFT</w:t>
+            </w:r>
+          </w:p>
+        </w:tc>
+        <w:tc>
+          <w:tcPr>
+            <w:tcW w:type="dxa" w:w="2880"/>
+          </w:tcPr>
+          <w:p>
+            <w:r>
+              <w:t>Slot ID do anúncio lateral esquerdo</w:t>
+            </w:r>
+          </w:p>
+        </w:tc>
+        <w:tc>
+          <w:tcPr>
+            <w:tcW w:type="dxa" w:w="2880"/>
+          </w:tcPr>
+          <w:p>
+            <w:r>
+              <w:t>Ex: 1234567891</w:t>
+            </w:r>
+          </w:p>
+        </w:tc>
+      </w:tr>
+      <w:tr>
+        <w:tc>
+          <w:tcPr>
+            <w:tcW w:type="dxa" w:w="2880"/>
+          </w:tcPr>
+          <w:p>
+            <w:r>
+              <w:t>AD_SLOT_RIGHT</w:t>
+            </w:r>
+          </w:p>
+        </w:tc>
+        <w:tc>
+          <w:tcPr>
+            <w:tcW w:type="dxa" w:w="2880"/>
+          </w:tcPr>
+          <w:p>
+            <w:r>
+              <w:t>Slot ID do anúncio lateral direito</w:t>
+            </w:r>
+          </w:p>
+        </w:tc>
+        <w:tc>
+          <w:tcPr>
+            <w:tcW w:type="dxa" w:w="2880"/>
+          </w:tcPr>
+          <w:p>
+            <w:r>
+              <w:t>Ex: 1234567892</w:t>
+            </w:r>
+          </w:p>
+        </w:tc>
+      </w:tr>
+      <w:tr>
+        <w:tc>
+          <w:tcPr>
+            <w:tcW w:type="dxa" w:w="2880"/>
+          </w:tcPr>
+          <w:p>
+            <w:r>
+              <w:t>AD_SLOT_IN_ARTICLE</w:t>
+            </w:r>
+          </w:p>
+        </w:tc>
+        <w:tc>
+          <w:tcPr>
+            <w:tcW w:type="dxa" w:w="2880"/>
+          </w:tcPr>
+          <w:p>
+            <w:r>
+              <w:t>Slot ID do anúncio in-article</w:t>
+            </w:r>
+          </w:p>
+        </w:tc>
+        <w:tc>
+          <w:tcPr>
+            <w:tcW w:type="dxa" w:w="2880"/>
+          </w:tcPr>
+          <w:p>
+            <w:r>
+              <w:t>Ex: 1234567893</w:t>
+            </w:r>
+          </w:p>
+        </w:tc>
+      </w:tr>
+      <w:tr>
+        <w:tc>
+          <w:tcPr>
+            <w:tcW w:type="dxa" w:w="2880"/>
+          </w:tcPr>
+          <w:p>
+            <w:r>
+              <w:t>AD_SLOT_BOTTOM</w:t>
+            </w:r>
+          </w:p>
+        </w:tc>
+        <w:tc>
+          <w:tcPr>
+            <w:tcW w:type="dxa" w:w="2880"/>
+          </w:tcPr>
+          <w:p>
+            <w:r>
+              <w:t>Slot ID do anúncio do rodapé</w:t>
+            </w:r>
+          </w:p>
+        </w:tc>
+        <w:tc>
+          <w:tcPr>
+            <w:tcW w:type="dxa" w:w="2880"/>
+          </w:tcPr>
+          <w:p>
+            <w:r>
+              <w:t>Ex: 1234567894</w:t>
+            </w:r>
+          </w:p>
+        </w:tc>
+      </w:tr>
+    </w:tbl>
+    <w:p>
+      <w:r>
+        <w:t>Para configurar: Render Dashboard → Service → Environment → Add Environment Variable. Após adicionar ou alterar uma variável, clique em "Manual Deploy" para aplicar.</w:t>
       </w:r>
     </w:p>
     <w:p/>

</xml_diff>

<commit_message>
feat: comprehensive SEO optimization for IPVA calculator rankings
- Structured Data: WebApplication, FAQPage, BreadcrumbList (JSON-LD)
- Optimized title, meta description and headings with high-volume keywords
- Added rich content section with state-by-state tax rate table
- Expanded FAQ to 8 questions covering top IPVA search queries
- Added sitemap.xml, robots.txt, favicon.svg, og-image.png
- Open Graph and Twitter Card meta tags with share image

Co-authored-by: Cursor <cursoragent@cursor.com>
</commit_message>
<xml_diff>
--- a/IPVA_Calculator_Documentacao.docx
+++ b/IPVA_Calculator_Documentacao.docx
@@ -1936,7 +1936,325 @@
         <w:pStyle w:val="Heading1"/>
       </w:pPr>
       <w:r>
-        <w:t>10. Sobre a PEC do IPVA</w:t>
+        <w:t>10. SEO (Otimização para Mecanismos de Busca)</w:t>
+      </w:r>
+    </w:p>
+    <w:p>
+      <w:r>
+        <w:t>O site foi otimizado para posicionar nas primeiras posições do Google para buscas como "calculadora IPVA", "novo IPVA", "calcular IPVA 2026" e termos relacionados.</w:t>
+      </w:r>
+    </w:p>
+    <w:p>
+      <w:pPr>
+        <w:pStyle w:val="Heading2"/>
+      </w:pPr>
+      <w:r>
+        <w:t>10.1. Keywords Alvo</w:t>
+      </w:r>
+    </w:p>
+    <w:p>
+      <w:pPr>
+        <w:pStyle w:val="ListBullet"/>
+      </w:pPr>
+      <w:r>
+        <w:t>calculadora IPVA / calculadora IPVA 2026</w:t>
+      </w:r>
+    </w:p>
+    <w:p>
+      <w:pPr>
+        <w:pStyle w:val="ListBullet"/>
+      </w:pPr>
+      <w:r>
+        <w:t>calcular IPVA / calcular IPVA do meu carro</w:t>
+      </w:r>
+    </w:p>
+    <w:p>
+      <w:pPr>
+        <w:pStyle w:val="ListBullet"/>
+      </w:pPr>
+      <w:r>
+        <w:t>novo IPVA / PEC IPVA / teto 1% IPVA</w:t>
+      </w:r>
+    </w:p>
+    <w:p>
+      <w:pPr>
+        <w:pStyle w:val="ListBullet"/>
+      </w:pPr>
+      <w:r>
+        <w:t>simulador IPVA / simular IPVA</w:t>
+      </w:r>
+    </w:p>
+    <w:p>
+      <w:pPr>
+        <w:pStyle w:val="ListBullet"/>
+      </w:pPr>
+      <w:r>
+        <w:t>alíquota IPVA por estado</w:t>
+      </w:r>
+    </w:p>
+    <w:p>
+      <w:pPr>
+        <w:pStyle w:val="ListBullet"/>
+      </w:pPr>
+      <w:r>
+        <w:t>quanto vou pagar de IPVA / valor IPVA</w:t>
+      </w:r>
+    </w:p>
+    <w:p>
+      <w:pPr>
+        <w:pStyle w:val="ListBullet"/>
+      </w:pPr>
+      <w:r>
+        <w:t>IPVA mais barato / economia IPVA</w:t>
+      </w:r>
+    </w:p>
+    <w:p>
+      <w:pPr>
+        <w:pStyle w:val="ListBullet"/>
+      </w:pPr>
+      <w:r>
+        <w:t>tabela FIPE IPVA</w:t>
+      </w:r>
+    </w:p>
+    <w:p>
+      <w:pPr>
+        <w:pStyle w:val="Heading2"/>
+      </w:pPr>
+      <w:r>
+        <w:t>10.2. Técnicas Implementadas</w:t>
+      </w:r>
+    </w:p>
+    <w:p>
+      <w:pPr>
+        <w:pStyle w:val="ListBullet"/>
+      </w:pPr>
+      <w:r>
+        <w:rPr>
+          <w:b/>
+        </w:rPr>
+        <w:t xml:space="preserve">Structured Data (JSON-LD): </w:t>
+      </w:r>
+      <w:r>
+        <w:t>Schema WebApplication, FAQPage e BreadcrumbList para rich snippets no Google</w:t>
+      </w:r>
+    </w:p>
+    <w:p>
+      <w:pPr>
+        <w:pStyle w:val="ListBullet"/>
+      </w:pPr>
+      <w:r>
+        <w:rPr>
+          <w:b/>
+        </w:rPr>
+        <w:t xml:space="preserve">Title Tag Otimizado: </w:t>
+      </w:r>
+      <w:r>
+        <w:t>"Calculadora IPVA 2026 — Simule o Novo IPVA com Teto de 1% | Todos os Estados" (60 chars, keyword-first)</w:t>
+      </w:r>
+    </w:p>
+    <w:p>
+      <w:pPr>
+        <w:pStyle w:val="ListBullet"/>
+      </w:pPr>
+      <w:r>
+        <w:rPr>
+          <w:b/>
+        </w:rPr>
+        <w:t xml:space="preserve">Meta Description: </w:t>
+      </w:r>
+      <w:r>
+        <w:t>160 chars com CTA, keywords primárias e diferencial (grátis, todos estados)</w:t>
+      </w:r>
+    </w:p>
+    <w:p>
+      <w:pPr>
+        <w:pStyle w:val="ListBullet"/>
+      </w:pPr>
+      <w:r>
+        <w:rPr>
+          <w:b/>
+        </w:rPr>
+        <w:t xml:space="preserve">Heading Hierarchy: </w:t>
+      </w:r>
+      <w:r>
+        <w:t>H1 com keyword principal, H2s com variações, H3s com long-tail</w:t>
+      </w:r>
+    </w:p>
+    <w:p>
+      <w:pPr>
+        <w:pStyle w:val="ListBullet"/>
+      </w:pPr>
+      <w:r>
+        <w:rPr>
+          <w:b/>
+        </w:rPr>
+        <w:t xml:space="preserve">Conteúdo Informativo: </w:t>
+      </w:r>
+      <w:r>
+        <w:t>Seção com tabela de alíquotas por estado, explicação de cálculo e mudanças da PEC</w:t>
+      </w:r>
+    </w:p>
+    <w:p>
+      <w:pPr>
+        <w:pStyle w:val="ListBullet"/>
+      </w:pPr>
+      <w:r>
+        <w:rPr>
+          <w:b/>
+        </w:rPr>
+        <w:t xml:space="preserve">FAQ Expandido: </w:t>
+      </w:r>
+      <w:r>
+        <w:t>8 perguntas cobrindo as principais buscas relacionadas ao IPVA</w:t>
+      </w:r>
+    </w:p>
+    <w:p>
+      <w:pPr>
+        <w:pStyle w:val="ListBullet"/>
+      </w:pPr>
+      <w:r>
+        <w:rPr>
+          <w:b/>
+        </w:rPr>
+        <w:t xml:space="preserve">Open Graph + Twitter Cards: </w:t>
+      </w:r>
+      <w:r>
+        <w:t>Imagem OG 1200x630px para compartilhamento em redes sociais</w:t>
+      </w:r>
+    </w:p>
+    <w:p>
+      <w:pPr>
+        <w:pStyle w:val="ListBullet"/>
+      </w:pPr>
+      <w:r>
+        <w:rPr>
+          <w:b/>
+        </w:rPr>
+        <w:t xml:space="preserve">Sitemap.xml: </w:t>
+      </w:r>
+      <w:r>
+        <w:t>Mapa do site para indexação rápida pelo Google</w:t>
+      </w:r>
+    </w:p>
+    <w:p>
+      <w:pPr>
+        <w:pStyle w:val="ListBullet"/>
+      </w:pPr>
+      <w:r>
+        <w:rPr>
+          <w:b/>
+        </w:rPr>
+        <w:t xml:space="preserve">Robots.txt: </w:t>
+      </w:r>
+      <w:r>
+        <w:t>Permite indexação total com referência ao sitemap</w:t>
+      </w:r>
+    </w:p>
+    <w:p>
+      <w:pPr>
+        <w:pStyle w:val="ListBullet"/>
+      </w:pPr>
+      <w:r>
+        <w:rPr>
+          <w:b/>
+        </w:rPr>
+        <w:t xml:space="preserve">Canonical URL: </w:t>
+      </w:r>
+      <w:r>
+        <w:t>Evita conteúdo duplicado: https://ipva.fsncompany.com.br</w:t>
+      </w:r>
+    </w:p>
+    <w:p>
+      <w:pPr>
+        <w:pStyle w:val="ListBullet"/>
+      </w:pPr>
+      <w:r>
+        <w:rPr>
+          <w:b/>
+        </w:rPr>
+        <w:t xml:space="preserve">Favicon SVG: </w:t>
+      </w:r>
+      <w:r>
+        <w:t>Ícone vetorial para abas do navegador e bookmarks</w:t>
+      </w:r>
+    </w:p>
+    <w:p>
+      <w:pPr>
+        <w:pStyle w:val="ListBullet"/>
+      </w:pPr>
+      <w:r>
+        <w:rPr>
+          <w:b/>
+        </w:rPr>
+        <w:t xml:space="preserve">Semantic HTML: </w:t>
+      </w:r>
+      <w:r>
+        <w:t>Tags header, main, section, footer, details para acessibilidade e SEO</w:t>
+      </w:r>
+    </w:p>
+    <w:p>
+      <w:pPr>
+        <w:pStyle w:val="Heading2"/>
+      </w:pPr>
+      <w:r>
+        <w:t>10.3. Próximos Passos para SEO</w:t>
+      </w:r>
+    </w:p>
+    <w:p>
+      <w:pPr>
+        <w:pStyle w:val="ListNumber"/>
+      </w:pPr>
+      <w:r>
+        <w:t>Cadastrar o site no Google Search Console (search.google.com/search-console)</w:t>
+      </w:r>
+    </w:p>
+    <w:p>
+      <w:pPr>
+        <w:pStyle w:val="ListNumber"/>
+      </w:pPr>
+      <w:r>
+        <w:t>Submeter o sitemap.xml pelo Search Console</w:t>
+      </w:r>
+    </w:p>
+    <w:p>
+      <w:pPr>
+        <w:pStyle w:val="ListNumber"/>
+      </w:pPr>
+      <w:r>
+        <w:t>Cadastrar no Google Analytics 4 para acompanhar tráfego orgânico</w:t>
+      </w:r>
+    </w:p>
+    <w:p>
+      <w:pPr>
+        <w:pStyle w:val="ListNumber"/>
+      </w:pPr>
+      <w:r>
+        <w:t>Criar conteúdo complementar (blog posts sobre IPVA, dicas de economia)</w:t>
+      </w:r>
+    </w:p>
+    <w:p>
+      <w:pPr>
+        <w:pStyle w:val="ListNumber"/>
+      </w:pPr>
+      <w:r>
+        <w:t>Buscar backlinks em sites de notícias automotivas e financeiras</w:t>
+      </w:r>
+    </w:p>
+    <w:p>
+      <w:pPr>
+        <w:pStyle w:val="ListNumber"/>
+      </w:pPr>
+      <w:r>
+        <w:t>Monitorar posições com Google Search Console → Performance</w:t>
+      </w:r>
+    </w:p>
+    <w:p/>
+    <w:p>
+      <w:pPr>
+        <w:pStyle w:val="Heading1"/>
+      </w:pPr>
+      <w:r>
+        <w:t>11. Sobre a PEC do IPVA</w:t>
       </w:r>
     </w:p>
     <w:p>

</xml_diff>

<commit_message>
feat: add marketing materials, copies and monetization strategy
- 4 Instagram Story banners (economy, percentage, form mockup, urgency)
- 2 Instagram Feed banners (comparison, states infographic)
- Complete copy texts for captions and stories
- Marketing strategy with editorial calendar
- Monetization guide with CPM comparison by ad format

Co-authored-by: Cursor <cursoragent@cursor.com>
</commit_message>
<xml_diff>
--- a/IPVA_Calculator_Documentacao.docx
+++ b/IPVA_Calculator_Documentacao.docx
@@ -2254,7 +2254,611 @@
         <w:pStyle w:val="Heading1"/>
       </w:pPr>
       <w:r>
-        <w:t>11. Sobre a PEC do IPVA</w:t>
+        <w:t>11. Estratégia de Marketing e Divulgação</w:t>
+      </w:r>
+    </w:p>
+    <w:p>
+      <w:pPr>
+        <w:pStyle w:val="Heading2"/>
+      </w:pPr>
+      <w:r>
+        <w:t>11.1. Materiais Criados</w:t>
+      </w:r>
+    </w:p>
+    <w:p>
+      <w:r>
+        <w:t>Os materiais de divulgação estão na pasta /marketing/ do projeto:</w:t>
+      </w:r>
+    </w:p>
+    <w:tbl>
+      <w:tblPr>
+        <w:tblStyle w:val="LightGrid-Accent1"/>
+        <w:tblW w:type="auto" w:w="0"/>
+        <w:jc w:val="center"/>
+        <w:tblLook w:firstColumn="1" w:firstRow="1" w:lastColumn="0" w:lastRow="0" w:noHBand="0" w:noVBand="1" w:val="04A0"/>
+      </w:tblPr>
+      <w:tblGrid>
+        <w:gridCol w:w="4320"/>
+        <w:gridCol w:w="4320"/>
+      </w:tblGrid>
+      <w:tr>
+        <w:tc>
+          <w:tcPr>
+            <w:tcW w:type="dxa" w:w="4320"/>
+          </w:tcPr>
+          <w:p>
+            <w:r>
+              <w:t>Arquivo</w:t>
+            </w:r>
+          </w:p>
+        </w:tc>
+        <w:tc>
+          <w:tcPr>
+            <w:tcW w:type="dxa" w:w="4320"/>
+          </w:tcPr>
+          <w:p>
+            <w:r>
+              <w:t>Descrição</w:t>
+            </w:r>
+          </w:p>
+        </w:tc>
+      </w:tr>
+      <w:tr>
+        <w:tc>
+          <w:tcPr>
+            <w:tcW w:type="dxa" w:w="4320"/>
+          </w:tcPr>
+          <w:p>
+            <w:r>
+              <w:t>story-1-economia.png</w:t>
+            </w:r>
+          </w:p>
+        </w:tc>
+        <w:tc>
+          <w:tcPr>
+            <w:tcW w:type="dxa" w:w="4320"/>
+          </w:tcPr>
+          <w:p>
+            <w:r>
+              <w:t>Story: "Você paga IPVA demais" com comparação de valores</w:t>
+            </w:r>
+          </w:p>
+        </w:tc>
+      </w:tr>
+      <w:tr>
+        <w:tc>
+          <w:tcPr>
+            <w:tcW w:type="dxa" w:w="4320"/>
+          </w:tcPr>
+          <w:p>
+            <w:r>
+              <w:t>story-2-porcentagem.png</w:t>
+            </w:r>
+          </w:p>
+        </w:tc>
+        <w:tc>
+          <w:tcPr>
+            <w:tcW w:type="dxa" w:w="4320"/>
+          </w:tcPr>
+          <w:p>
+            <w:r>
+              <w:t>Story: "75% de economia" com dados por estado</w:t>
+            </w:r>
+          </w:p>
+        </w:tc>
+      </w:tr>
+      <w:tr>
+        <w:tc>
+          <w:tcPr>
+            <w:tcW w:type="dxa" w:w="4320"/>
+          </w:tcPr>
+          <w:p>
+            <w:r>
+              <w:t>story-3-formulario.png</w:t>
+            </w:r>
+          </w:p>
+        </w:tc>
+        <w:tc>
+          <w:tcPr>
+            <w:tcW w:type="dxa" w:w="4320"/>
+          </w:tcPr>
+          <w:p>
+            <w:r>
+              <w:t>Story: Mockup da calculadora com resultado</w:t>
+            </w:r>
+          </w:p>
+        </w:tc>
+      </w:tr>
+      <w:tr>
+        <w:tc>
+          <w:tcPr>
+            <w:tcW w:type="dxa" w:w="4320"/>
+          </w:tcPr>
+          <w:p>
+            <w:r>
+              <w:t>story-4-urgencia.png</w:t>
+            </w:r>
+          </w:p>
+        </w:tc>
+        <w:tc>
+          <w:tcPr>
+            <w:tcW w:type="dxa" w:w="4320"/>
+          </w:tcPr>
+          <w:p>
+            <w:r>
+              <w:t>Story: "O IPVA vai mudar" com urgência e CTA</w:t>
+            </w:r>
+          </w:p>
+        </w:tc>
+      </w:tr>
+      <w:tr>
+        <w:tc>
+          <w:tcPr>
+            <w:tcW w:type="dxa" w:w="4320"/>
+          </w:tcPr>
+          <w:p>
+            <w:r>
+              <w:t>feed-1-comparacao.png</w:t>
+            </w:r>
+          </w:p>
+        </w:tc>
+        <w:tc>
+          <w:tcPr>
+            <w:tcW w:type="dxa" w:w="4320"/>
+          </w:tcPr>
+          <w:p>
+            <w:r>
+              <w:t>Feed: Barra comparativa 4% → 1% com economia</w:t>
+            </w:r>
+          </w:p>
+        </w:tc>
+      </w:tr>
+      <w:tr>
+        <w:tc>
+          <w:tcPr>
+            <w:tcW w:type="dxa" w:w="4320"/>
+          </w:tcPr>
+          <w:p>
+            <w:r>
+              <w:t>feed-2-estados.png</w:t>
+            </w:r>
+          </w:p>
+        </w:tc>
+        <w:tc>
+          <w:tcPr>
+            <w:tcW w:type="dxa" w:w="4320"/>
+          </w:tcPr>
+          <w:p>
+            <w:r>
+              <w:t>Feed: Infográfico de alíquotas por estado</w:t>
+            </w:r>
+          </w:p>
+        </w:tc>
+      </w:tr>
+      <w:tr>
+        <w:tc>
+          <w:tcPr>
+            <w:tcW w:type="dxa" w:w="4320"/>
+          </w:tcPr>
+          <w:p>
+            <w:r>
+              <w:t>COPIES_E_ESTRATEGIA.md</w:t>
+            </w:r>
+          </w:p>
+        </w:tc>
+        <w:tc>
+          <w:tcPr>
+            <w:tcW w:type="dxa" w:w="4320"/>
+          </w:tcPr>
+          <w:p>
+            <w:r>
+              <w:t>Textos prontos para legendas, stories e outros canais</w:t>
+            </w:r>
+          </w:p>
+        </w:tc>
+      </w:tr>
+    </w:tbl>
+    <w:p>
+      <w:pPr>
+        <w:pStyle w:val="Heading2"/>
+      </w:pPr>
+      <w:r>
+        <w:t>11.2. Canais de Divulgação</w:t>
+      </w:r>
+    </w:p>
+    <w:p>
+      <w:pPr>
+        <w:pStyle w:val="ListBullet"/>
+      </w:pPr>
+      <w:r>
+        <w:rPr>
+          <w:b/>
+        </w:rPr>
+        <w:t xml:space="preserve">Instagram (Stories + Feed + Reels): </w:t>
+      </w:r>
+      <w:r>
+        <w:t>Canal principal. Stories com enquetes e quizzes, posts informativos, Reels mostrando a calculadora</w:t>
+      </w:r>
+    </w:p>
+    <w:p>
+      <w:pPr>
+        <w:pStyle w:val="ListBullet"/>
+      </w:pPr>
+      <w:r>
+        <w:rPr>
+          <w:b/>
+        </w:rPr>
+        <w:t xml:space="preserve">TikTok: </w:t>
+      </w:r>
+      <w:r>
+        <w:t>Repost dos Reels. Trends como "POV: você descobre que paga 4% de IPVA"</w:t>
+      </w:r>
+    </w:p>
+    <w:p>
+      <w:pPr>
+        <w:pStyle w:val="ListBullet"/>
+      </w:pPr>
+      <w:r>
+        <w:rPr>
+          <w:b/>
+        </w:rPr>
+        <w:t xml:space="preserve">Twitter/X: </w:t>
+      </w:r>
+      <w:r>
+        <w:t>Posts com dados e link. Responder threads sobre impostos</w:t>
+      </w:r>
+    </w:p>
+    <w:p>
+      <w:pPr>
+        <w:pStyle w:val="ListBullet"/>
+      </w:pPr>
+      <w:r>
+        <w:rPr>
+          <w:b/>
+        </w:rPr>
+        <w:t xml:space="preserve">WhatsApp: </w:t>
+      </w:r>
+      <w:r>
+        <w:t>Mensagens shareáveis para grupos de carros e financeiro</w:t>
+      </w:r>
+    </w:p>
+    <w:p>
+      <w:pPr>
+        <w:pStyle w:val="ListBullet"/>
+      </w:pPr>
+      <w:r>
+        <w:rPr>
+          <w:b/>
+        </w:rPr>
+        <w:t xml:space="preserve">Reddit / Fóruns: </w:t>
+      </w:r>
+      <w:r>
+        <w:t>Posts em r/brasil, r/investimentos, fóruns automotivos</w:t>
+      </w:r>
+    </w:p>
+    <w:p>
+      <w:pPr>
+        <w:pStyle w:val="Heading2"/>
+      </w:pPr>
+      <w:r>
+        <w:t>11.3. Monetização — Tipos de Ads por Receita</w:t>
+      </w:r>
+    </w:p>
+    <w:p>
+      <w:r>
+        <w:t>Formatos de anúncio ordenados por CPM (receita por mil impressões):</w:t>
+      </w:r>
+    </w:p>
+    <w:tbl>
+      <w:tblPr>
+        <w:tblStyle w:val="LightGrid-Accent1"/>
+        <w:tblW w:type="auto" w:w="0"/>
+        <w:jc w:val="center"/>
+        <w:tblLook w:firstColumn="1" w:firstRow="1" w:lastColumn="0" w:lastRow="0" w:noHBand="0" w:noVBand="1" w:val="04A0"/>
+      </w:tblPr>
+      <w:tblGrid>
+        <w:gridCol w:w="2880"/>
+        <w:gridCol w:w="2880"/>
+        <w:gridCol w:w="2880"/>
+      </w:tblGrid>
+      <w:tr>
+        <w:tc>
+          <w:tcPr>
+            <w:tcW w:type="dxa" w:w="2880"/>
+          </w:tcPr>
+          <w:p>
+            <w:r>
+              <w:t>Formato</w:t>
+            </w:r>
+          </w:p>
+        </w:tc>
+        <w:tc>
+          <w:tcPr>
+            <w:tcW w:type="dxa" w:w="2880"/>
+          </w:tcPr>
+          <w:p>
+            <w:r>
+              <w:t>CPM Médio</w:t>
+            </w:r>
+          </w:p>
+        </w:tc>
+        <w:tc>
+          <w:tcPr>
+            <w:tcW w:type="dxa" w:w="2880"/>
+          </w:tcPr>
+          <w:p>
+            <w:r>
+              <w:t>Posição</w:t>
+            </w:r>
+          </w:p>
+        </w:tc>
+      </w:tr>
+      <w:tr>
+        <w:tc>
+          <w:tcPr>
+            <w:tcW w:type="dxa" w:w="2880"/>
+          </w:tcPr>
+          <w:p>
+            <w:r>
+              <w:t>In-Article (Fluid)</w:t>
+            </w:r>
+          </w:p>
+        </w:tc>
+        <w:tc>
+          <w:tcPr>
+            <w:tcW w:type="dxa" w:w="2880"/>
+          </w:tcPr>
+          <w:p>
+            <w:r>
+              <w:t>R$ 8-25 CPM</w:t>
+            </w:r>
+          </w:p>
+        </w:tc>
+        <w:tc>
+          <w:tcPr>
+            <w:tcW w:type="dxa" w:w="2880"/>
+          </w:tcPr>
+          <w:p>
+            <w:r>
+              <w:t>Entre resultado e FAQ — maior receita</w:t>
+            </w:r>
+          </w:p>
+        </w:tc>
+      </w:tr>
+      <w:tr>
+        <w:tc>
+          <w:tcPr>
+            <w:tcW w:type="dxa" w:w="2880"/>
+          </w:tcPr>
+          <w:p>
+            <w:r>
+              <w:t>Leaderboard Top</w:t>
+            </w:r>
+          </w:p>
+        </w:tc>
+        <w:tc>
+          <w:tcPr>
+            <w:tcW w:type="dxa" w:w="2880"/>
+          </w:tcPr>
+          <w:p>
+            <w:r>
+              <w:t>R$ 5-15 CPM</w:t>
+            </w:r>
+          </w:p>
+        </w:tc>
+        <w:tc>
+          <w:tcPr>
+            <w:tcW w:type="dxa" w:w="2880"/>
+          </w:tcPr>
+          <w:p>
+            <w:r>
+              <w:t>Topo da página — alta visibilidade</w:t>
+            </w:r>
+          </w:p>
+        </w:tc>
+      </w:tr>
+      <w:tr>
+        <w:tc>
+          <w:tcPr>
+            <w:tcW w:type="dxa" w:w="2880"/>
+          </w:tcPr>
+          <w:p>
+            <w:r>
+              <w:t>Skyscraper Lateral</w:t>
+            </w:r>
+          </w:p>
+        </w:tc>
+        <w:tc>
+          <w:tcPr>
+            <w:tcW w:type="dxa" w:w="2880"/>
+          </w:tcPr>
+          <w:p>
+            <w:r>
+              <w:t>R$ 3-10 CPM</w:t>
+            </w:r>
+          </w:p>
+        </w:tc>
+        <w:tc>
+          <w:tcPr>
+            <w:tcW w:type="dxa" w:w="2880"/>
+          </w:tcPr>
+          <w:p>
+            <w:r>
+              <w:t>Laterais desktop — complementar</w:t>
+            </w:r>
+          </w:p>
+        </w:tc>
+      </w:tr>
+      <w:tr>
+        <w:tc>
+          <w:tcPr>
+            <w:tcW w:type="dxa" w:w="2880"/>
+          </w:tcPr>
+          <w:p>
+            <w:r>
+              <w:t>Leaderboard Bottom</w:t>
+            </w:r>
+          </w:p>
+        </w:tc>
+        <w:tc>
+          <w:tcPr>
+            <w:tcW w:type="dxa" w:w="2880"/>
+          </w:tcPr>
+          <w:p>
+            <w:r>
+              <w:t>R$ 2-8 CPM</w:t>
+            </w:r>
+          </w:p>
+        </w:tc>
+        <w:tc>
+          <w:tcPr>
+            <w:tcW w:type="dxa" w:w="2880"/>
+          </w:tcPr>
+          <w:p>
+            <w:r>
+              <w:t>Rodapé — menor engajamento</w:t>
+            </w:r>
+          </w:p>
+        </w:tc>
+      </w:tr>
+    </w:tbl>
+    <w:p>
+      <w:pPr>
+        <w:pStyle w:val="Heading2"/>
+      </w:pPr>
+      <w:r>
+        <w:t>11.4. Estimativa de Receita Mensal</w:t>
+      </w:r>
+    </w:p>
+    <w:tbl>
+      <w:tblPr>
+        <w:tblStyle w:val="LightGrid-Accent1"/>
+        <w:tblW w:type="auto" w:w="0"/>
+        <w:jc w:val="center"/>
+        <w:tblLook w:firstColumn="1" w:firstRow="1" w:lastColumn="0" w:lastRow="0" w:noHBand="0" w:noVBand="1" w:val="04A0"/>
+      </w:tblPr>
+      <w:tblGrid>
+        <w:gridCol w:w="4320"/>
+        <w:gridCol w:w="4320"/>
+      </w:tblGrid>
+      <w:tr>
+        <w:tc>
+          <w:tcPr>
+            <w:tcW w:type="dxa" w:w="4320"/>
+          </w:tcPr>
+          <w:p>
+            <w:r>
+              <w:t>Tráfego</w:t>
+            </w:r>
+          </w:p>
+        </w:tc>
+        <w:tc>
+          <w:tcPr>
+            <w:tcW w:type="dxa" w:w="4320"/>
+          </w:tcPr>
+          <w:p>
+            <w:r>
+              <w:t>Receita Estimada</w:t>
+            </w:r>
+          </w:p>
+        </w:tc>
+      </w:tr>
+      <w:tr>
+        <w:tc>
+          <w:tcPr>
+            <w:tcW w:type="dxa" w:w="4320"/>
+          </w:tcPr>
+          <w:p>
+            <w:r>
+              <w:t>1.000 visitas/dia</w:t>
+            </w:r>
+          </w:p>
+        </w:tc>
+        <w:tc>
+          <w:tcPr>
+            <w:tcW w:type="dxa" w:w="4320"/>
+          </w:tcPr>
+          <w:p>
+            <w:r>
+              <w:t>R$ 30-80/mês (AdSense)</w:t>
+            </w:r>
+          </w:p>
+        </w:tc>
+      </w:tr>
+      <w:tr>
+        <w:tc>
+          <w:tcPr>
+            <w:tcW w:type="dxa" w:w="4320"/>
+          </w:tcPr>
+          <w:p>
+            <w:r>
+              <w:t>5.000 visitas/dia</w:t>
+            </w:r>
+          </w:p>
+        </w:tc>
+        <w:tc>
+          <w:tcPr>
+            <w:tcW w:type="dxa" w:w="4320"/>
+          </w:tcPr>
+          <w:p>
+            <w:r>
+              <w:t>R$ 150-400/mês (AdSense) | R$ 400-1.000 (Mediavine)</w:t>
+            </w:r>
+          </w:p>
+        </w:tc>
+      </w:tr>
+      <w:tr>
+        <w:tc>
+          <w:tcPr>
+            <w:tcW w:type="dxa" w:w="4320"/>
+          </w:tcPr>
+          <w:p>
+            <w:r>
+              <w:t>10.000 visitas/dia</w:t>
+            </w:r>
+          </w:p>
+        </w:tc>
+        <w:tc>
+          <w:tcPr>
+            <w:tcW w:type="dxa" w:w="4320"/>
+          </w:tcPr>
+          <w:p>
+            <w:r>
+              <w:t>R$ 300-900/mês (AdSense) | R$ 900-2.500 (Mediavine)</w:t>
+            </w:r>
+          </w:p>
+        </w:tc>
+      </w:tr>
+      <w:tr>
+        <w:tc>
+          <w:tcPr>
+            <w:tcW w:type="dxa" w:w="4320"/>
+          </w:tcPr>
+          <w:p>
+            <w:r>
+              <w:t>50.000 visitas/dia</w:t>
+            </w:r>
+          </w:p>
+        </w:tc>
+        <w:tc>
+          <w:tcPr>
+            <w:tcW w:type="dxa" w:w="4320"/>
+          </w:tcPr>
+          <w:p>
+            <w:r>
+              <w:t>R$ 1.500-5.000/mês (AdSense) | R$ 5.000-15.000 (Mediavine)</w:t>
+            </w:r>
+          </w:p>
+        </w:tc>
+      </w:tr>
+    </w:tbl>
+    <w:p/>
+    <w:p>
+      <w:pPr>
+        <w:pStyle w:val="Heading1"/>
+      </w:pPr>
+      <w:r>
+        <w:t>12. Sobre a PEC do IPVA</w:t>
       </w:r>
     </w:p>
     <w:p>

</xml_diff>